<commit_message>
Deploy preview for PR 100 🛫
</commit_message>
<xml_diff>
--- a/pr-preview/pr-100/chapters/13-standardization-parametric-g-formula-tracked-changes.docx
+++ b/pr-preview/pr-100/chapters/13-standardization-parametric-g-formula-tracked-changes.docx
@@ -4163,16 +4163,6 @@
         </w:tc>
       </w:tr>
     </w:tbl>
-    <w:p>
-      <w:pPr>
-        <w:pStyle w:val="FirstParagraph"/>
-      </w:pPr>
-      <w:ins w:id="30" w:author="PR Preview" w:date="2024-01-01T00:00:00Z">
-        <w:r>
-          <w:t xml:space="preserve"> </w:t>
-        </w:r>
-      </w:ins>
-    </w:p>
     <w:tbl>
       <w:tblPr>
         <w:tblStyle w:val="Table"/>
@@ -4203,7 +4193,7 @@
           </w:tcPr>
           <w:p>
             <w:pPr>
-              <w:pStyle w:val="BodyText"/>
+              <w:pStyle w:val="FirstParagraph"/>
             </w:pPr>
             <w:pPr>
               <w:spacing w:before="0" w:after="0"/>
@@ -4278,6 +4268,9 @@
             <w:pPr>
               <w:pStyle w:val="BodyText"/>
             </w:pPr>
+            <w:pPr>
+              <w:spacing w:before="16" w:after="16"/>
+            </w:pPr>
             <w:r>
               <w:t xml:space="preserve">The conditional (on</w:t>
             </w:r>
@@ -4341,17 +4334,17 @@
       <w:pPr>
         <w:pStyle w:val="FirstParagraph"/>
       </w:pPr>
-      <w:ins w:id="33" w:author="PR Preview" w:date="2024-01-01T00:00:00Z">
+      <w:ins w:id="32" w:author="PR Preview" w:date="2024-01-01T00:00:00Z">
         <w:r>
           <w:t xml:space="preserve">We do</w:t>
         </w:r>
       </w:ins>
-      <w:ins w:id="33" w:author="PR Preview" w:date="2024-01-01T00:00:00Z">
+      <w:ins w:id="32" w:author="PR Preview" w:date="2024-01-01T00:00:00Z">
         <w:r>
           <w:t xml:space="preserve"> </w:t>
         </w:r>
       </w:ins>
-      <w:ins w:id="33" w:author="PR Preview" w:date="2024-01-01T00:00:00Z">
+      <w:ins w:id="32" w:author="PR Preview" w:date="2024-01-01T00:00:00Z">
         <w:r>
           <w:rPr>
             <w:b/>
@@ -4360,17 +4353,17 @@
           <w:t xml:space="preserve">not</w:t>
         </w:r>
       </w:ins>
-      <w:ins w:id="33" w:author="PR Preview" w:date="2024-01-01T00:00:00Z">
+      <w:ins w:id="32" w:author="PR Preview" w:date="2024-01-01T00:00:00Z">
         <w:r>
           <w:t xml:space="preserve"> </w:t>
         </w:r>
       </w:ins>
-      <w:ins w:id="33" w:author="PR Preview" w:date="2024-01-01T00:00:00Z">
+      <w:ins w:id="32" w:author="PR Preview" w:date="2024-01-01T00:00:00Z">
         <w:r>
           <w:t xml:space="preserve">need to estimate</w:t>
         </w:r>
       </w:ins>
-      <w:ins w:id="33" w:author="PR Preview" w:date="2024-01-01T00:00:00Z">
+      <w:ins w:id="32" w:author="PR Preview" w:date="2024-01-01T00:00:00Z">
         <w:r>
           <w:t xml:space="preserve"> </w:t>
         </w:r>
@@ -4407,7 +4400,7 @@
           <m:t>]</m:t>
         </m:r>
       </m:oMath>
-      <w:ins w:id="33" w:author="PR Preview" w:date="2024-01-01T00:00:00Z">
+      <w:ins w:id="32" w:author="PR Preview" w:date="2024-01-01T00:00:00Z">
         <w:r>
           <w:t xml:space="preserve">.</w:t>
         </w:r>
@@ -4709,7 +4702,7 @@
       <w:pPr>
         <w:pStyle w:val="FirstParagraph"/>
       </w:pPr>
-      <w:ins w:id="34" w:author="PR Preview" w:date="2024-01-01T00:00:00Z">
+      <w:ins w:id="33" w:author="PR Preview" w:date="2024-01-01T00:00:00Z">
         <w:r>
           <w:t xml:space="preserve"> </w:t>
         </w:r>
@@ -5036,12 +5029,12 @@
       <w:pPr>
         <w:pStyle w:val="BodyText"/>
       </w:pPr>
-      <w:ins w:id="35" w:author="PR Preview" w:date="2024-01-01T00:00:00Z">
+      <w:ins w:id="34" w:author="PR Preview" w:date="2024-01-01T00:00:00Z">
         <w:r>
           <w:t xml:space="preserve">By</w:t>
         </w:r>
       </w:ins>
-      <w:ins w:id="35" w:author="PR Preview" w:date="2024-01-01T00:00:00Z">
+      <w:ins w:id="34" w:author="PR Preview" w:date="2024-01-01T00:00:00Z">
         <w:r>
           <w:t xml:space="preserve"> </w:t>
         </w:r>
@@ -5054,17 +5047,17 @@
           <w:t xml:space="preserve">Proposition 1</w:t>
         </w:r>
       </w:hyperlink>
-      <w:ins w:id="35" w:author="PR Preview" w:date="2024-01-01T00:00:00Z">
+      <w:ins w:id="34" w:author="PR Preview" w:date="2024-01-01T00:00:00Z">
         <w:r>
           <w:t xml:space="preserve">, the standardized mean can be estimated by averaging the model predictions over the</w:t>
         </w:r>
       </w:ins>
-      <w:ins w:id="35" w:author="PR Preview" w:date="2024-01-01T00:00:00Z">
+      <w:ins w:id="34" w:author="PR Preview" w:date="2024-01-01T00:00:00Z">
         <w:r>
           <w:t xml:space="preserve"> </w:t>
         </w:r>
       </w:ins>
-      <w:ins w:id="35" w:author="PR Preview" w:date="2024-01-01T00:00:00Z">
+      <w:ins w:id="34" w:author="PR Preview" w:date="2024-01-01T00:00:00Z">
         <w:r>
           <w:rPr>
             <w:b/>
@@ -5073,17 +5066,17 @@
           <w:t xml:space="preserve">empirical distribution</w:t>
         </w:r>
       </w:ins>
-      <w:ins w:id="35" w:author="PR Preview" w:date="2024-01-01T00:00:00Z">
+      <w:ins w:id="34" w:author="PR Preview" w:date="2024-01-01T00:00:00Z">
         <w:r>
           <w:t xml:space="preserve"> </w:t>
         </w:r>
       </w:ins>
-      <w:ins w:id="35" w:author="PR Preview" w:date="2024-01-01T00:00:00Z">
+      <w:ins w:id="34" w:author="PR Preview" w:date="2024-01-01T00:00:00Z">
         <w:r>
           <w:t xml:space="preserve">of</w:t>
         </w:r>
       </w:ins>
-      <w:ins w:id="35" w:author="PR Preview" w:date="2024-01-01T00:00:00Z">
+      <w:ins w:id="34" w:author="PR Preview" w:date="2024-01-01T00:00:00Z">
         <w:r>
           <w:t xml:space="preserve"> </w:t>
         </w:r>
@@ -5093,7 +5086,7 @@
           <m:t>L</m:t>
         </m:r>
       </m:oMath>
-      <w:ins w:id="35" w:author="PR Preview" w:date="2024-01-01T00:00:00Z">
+      <w:ins w:id="34" w:author="PR Preview" w:date="2024-01-01T00:00:00Z">
         <w:r>
           <w:t xml:space="preserve">:</w:t>
         </w:r>
@@ -5271,12 +5264,12 @@
       <w:pPr>
         <w:pStyle w:val="BodyText"/>
       </w:pPr>
-      <w:ins w:id="38" w:author="PR Preview" w:date="2024-01-01T00:00:00Z">
+      <w:ins w:id="37" w:author="PR Preview" w:date="2024-01-01T00:00:00Z">
         <w:r>
           <w:t xml:space="preserve">Replacing</w:t>
         </w:r>
       </w:ins>
-      <w:ins w:id="38" w:author="PR Preview" w:date="2024-01-01T00:00:00Z">
+      <w:ins w:id="37" w:author="PR Preview" w:date="2024-01-01T00:00:00Z">
         <w:r>
           <w:t xml:space="preserve"> </w:t>
         </w:r>
@@ -5286,17 +5279,17 @@
           <m:t>g</m:t>
         </m:r>
       </m:oMath>
-      <w:ins w:id="38" w:author="PR Preview" w:date="2024-01-01T00:00:00Z">
+      <w:ins w:id="37" w:author="PR Preview" w:date="2024-01-01T00:00:00Z">
         <w:r>
           <w:t xml:space="preserve"> </w:t>
         </w:r>
       </w:ins>
-      <w:ins w:id="38" w:author="PR Preview" w:date="2024-01-01T00:00:00Z">
+      <w:ins w:id="37" w:author="PR Preview" w:date="2024-01-01T00:00:00Z">
         <w:r>
           <w:t xml:space="preserve">by its estimate</w:t>
         </w:r>
       </w:ins>
-      <w:ins w:id="38" w:author="PR Preview" w:date="2024-01-01T00:00:00Z">
+      <w:ins w:id="37" w:author="PR Preview" w:date="2024-01-01T00:00:00Z">
         <w:r>
           <w:t xml:space="preserve"> </w:t>
         </w:r>
@@ -5313,17 +5306,17 @@
           </m:e>
         </m:acc>
       </m:oMath>
-      <w:ins w:id="38" w:author="PR Preview" w:date="2024-01-01T00:00:00Z">
+      <w:ins w:id="37" w:author="PR Preview" w:date="2024-01-01T00:00:00Z">
         <w:r>
           <w:t xml:space="preserve"> </w:t>
         </w:r>
       </w:ins>
-      <w:ins w:id="38" w:author="PR Preview" w:date="2024-01-01T00:00:00Z">
+      <w:ins w:id="37" w:author="PR Preview" w:date="2024-01-01T00:00:00Z">
         <w:r>
           <w:t xml:space="preserve">and the distribution of</w:t>
         </w:r>
       </w:ins>
-      <w:ins w:id="38" w:author="PR Preview" w:date="2024-01-01T00:00:00Z">
+      <w:ins w:id="37" w:author="PR Preview" w:date="2024-01-01T00:00:00Z">
         <w:r>
           <w:t xml:space="preserve"> </w:t>
         </w:r>
@@ -5333,17 +5326,17 @@
           <m:t>L</m:t>
         </m:r>
       </m:oMath>
-      <w:ins w:id="38" w:author="PR Preview" w:date="2024-01-01T00:00:00Z">
+      <w:ins w:id="37" w:author="PR Preview" w:date="2024-01-01T00:00:00Z">
         <w:r>
           <w:t xml:space="preserve"> </w:t>
         </w:r>
       </w:ins>
-      <w:ins w:id="38" w:author="PR Preview" w:date="2024-01-01T00:00:00Z">
+      <w:ins w:id="37" w:author="PR Preview" w:date="2024-01-01T00:00:00Z">
         <w:r>
           <w:t xml:space="preserve">by the empirical distribution (mass</w:t>
         </w:r>
       </w:ins>
-      <w:ins w:id="38" w:author="PR Preview" w:date="2024-01-01T00:00:00Z">
+      <w:ins w:id="37" w:author="PR Preview" w:date="2024-01-01T00:00:00Z">
         <w:r>
           <w:t xml:space="preserve"> </w:t>
         </w:r>
@@ -5362,17 +5355,17 @@
           <m:t>n</m:t>
         </m:r>
       </m:oMath>
-      <w:ins w:id="38" w:author="PR Preview" w:date="2024-01-01T00:00:00Z">
+      <w:ins w:id="37" w:author="PR Preview" w:date="2024-01-01T00:00:00Z">
         <w:r>
           <w:t xml:space="preserve"> </w:t>
         </w:r>
       </w:ins>
-      <w:ins w:id="38" w:author="PR Preview" w:date="2024-01-01T00:00:00Z">
+      <w:ins w:id="37" w:author="PR Preview" w:date="2024-01-01T00:00:00Z">
         <w:r>
           <w:t xml:space="preserve">on each observed</w:t>
         </w:r>
       </w:ins>
-      <w:ins w:id="38" w:author="PR Preview" w:date="2024-01-01T00:00:00Z">
+      <w:ins w:id="37" w:author="PR Preview" w:date="2024-01-01T00:00:00Z">
         <w:r>
           <w:t xml:space="preserve"> </w:t>
         </w:r>
@@ -5391,12 +5384,12 @@
           </m:sub>
         </m:sSub>
       </m:oMath>
-      <w:ins w:id="38" w:author="PR Preview" w:date="2024-01-01T00:00:00Z">
+      <w:ins w:id="37" w:author="PR Preview" w:date="2024-01-01T00:00:00Z">
         <w:r>
           <w:t xml:space="preserve">) gives</w:t>
         </w:r>
       </w:ins>
-      <w:ins w:id="38" w:author="PR Preview" w:date="2024-01-01T00:00:00Z">
+      <w:ins w:id="37" w:author="PR Preview" w:date="2024-01-01T00:00:00Z">
         <w:r>
           <w:t xml:space="preserve"> </w:t>
         </w:r>
@@ -5472,7 +5465,7 @@
           <m:t>)</m:t>
         </m:r>
       </m:oMath>
-      <w:ins w:id="38" w:author="PR Preview" w:date="2024-01-01T00:00:00Z">
+      <w:ins w:id="37" w:author="PR Preview" w:date="2024-01-01T00:00:00Z">
         <w:r>
           <w:t xml:space="preserve">.</w:t>
         </w:r>
@@ -6629,16 +6622,6 @@
         </w:tc>
       </w:tr>
     </w:tbl>
-    <w:p>
-      <w:pPr>
-        <w:pStyle w:val="BodyText"/>
-      </w:pPr>
-      <w:ins w:id="45" w:author="PR Preview" w:date="2024-01-01T00:00:00Z">
-        <w:r>
-          <w:t xml:space="preserve"> </w:t>
-        </w:r>
-      </w:ins>
-    </w:p>
     <w:tbl>
       <w:tblPr>
         <w:tblStyle w:val="Table"/>
@@ -6744,6 +6727,9 @@
             <w:pPr>
               <w:pStyle w:val="BodyText"/>
             </w:pPr>
+            <w:pPr>
+              <w:spacing w:before="16" w:after="16"/>
+            </w:pPr>
             <w:r>
               <w:t xml:space="preserve">The two intervals in the book belong to different methods.</w:t>
             </w:r>
@@ -6838,16 +6824,6 @@
         </w:tc>
       </w:tr>
     </w:tbl>
-    <w:p>
-      <w:pPr>
-        <w:pStyle w:val="BodyText"/>
-      </w:pPr>
-      <w:ins w:id="46" w:author="PR Preview" w:date="2024-01-01T00:00:00Z">
-        <w:r>
-          <w:t xml:space="preserve"> </w:t>
-        </w:r>
-      </w:ins>
-    </w:p>
     <w:tbl>
       <w:tblPr>
         <w:tblStyle w:val="Table"/>
@@ -7568,16 +7544,6 @@
         </w:tc>
       </w:tr>
     </w:tbl>
-    <w:p>
-      <w:pPr>
-        <w:pStyle w:val="FirstParagraph"/>
-      </w:pPr>
-      <w:ins w:id="49" w:author="PR Preview" w:date="2024-01-01T00:00:00Z">
-        <w:r>
-          <w:t xml:space="preserve"> </w:t>
-        </w:r>
-      </w:ins>
-    </w:p>
     <w:tbl>
       <w:tblPr>
         <w:tblStyle w:val="Table"/>
@@ -7608,7 +7574,7 @@
           </w:tcPr>
           <w:p>
             <w:pPr>
-              <w:pStyle w:val="BodyText"/>
+              <w:pStyle w:val="FirstParagraph"/>
             </w:pPr>
             <w:pPr>
               <w:spacing w:before="0" w:after="0"/>
@@ -7921,7 +7887,7 @@
       <w:pPr>
         <w:pStyle w:val="BodyText"/>
       </w:pPr>
-      <w:ins w:id="52" w:author="PR Preview" w:date="2024-01-01T00:00:00Z">
+      <w:ins w:id="48" w:author="PR Preview" w:date="2024-01-01T00:00:00Z">
         <w:r>
           <w:t xml:space="preserve"> </w:t>
         </w:r>
@@ -8093,16 +8059,6 @@
         </w:tc>
       </w:tr>
     </w:tbl>
-    <w:p>
-      <w:pPr>
-        <w:pStyle w:val="FirstParagraph"/>
-      </w:pPr>
-      <w:ins w:id="53" w:author="PR Preview" w:date="2024-01-01T00:00:00Z">
-        <w:r>
-          <w:t xml:space="preserve"> </w:t>
-        </w:r>
-      </w:ins>
-    </w:p>
     <w:tbl>
       <w:tblPr>
         <w:tblStyle w:val="Table"/>
@@ -8133,7 +8089,7 @@
           </w:tcPr>
           <w:p>
             <w:pPr>
-              <w:pStyle w:val="BodyText"/>
+              <w:pStyle w:val="FirstParagraph"/>
             </w:pPr>
             <w:pPr>
               <w:spacing w:before="0" w:after="0"/>
@@ -8208,6 +8164,9 @@
             <w:pPr>
               <w:pStyle w:val="BodyText"/>
             </w:pPr>
+            <w:pPr>
+              <w:spacing w:before="16"/>
+            </w:pPr>
             <w:r>
               <w:t xml:space="preserve">Robins (1986)</w:t>
             </w:r>
@@ -8285,6 +8244,9 @@
           <w:p>
             <w:pPr>
               <w:pStyle w:val="BodyText"/>
+            </w:pPr>
+            <w:pPr>
+              <w:spacing w:after="16"/>
             </w:pPr>
             <w:r>
               <w:t xml:space="preserve">Part III defines the g-formula for time-varying treatments.</w:t>
@@ -8415,7 +8377,7 @@
       <w:pPr>
         <w:pStyle w:val="BodyText"/>
       </w:pPr>
-      <w:ins w:id="56" w:author="PR Preview" w:date="2024-01-01T00:00:00Z">
+      <w:ins w:id="51" w:author="PR Preview" w:date="2024-01-01T00:00:00Z">
         <w:r>
           <w:t xml:space="preserve"> </w:t>
         </w:r>
@@ -8606,7 +8568,7 @@
       <w:pPr>
         <w:pStyle w:val="FirstParagraph"/>
       </w:pPr>
-      <w:ins w:id="57" w:author="PR Preview" w:date="2024-01-01T00:00:00Z">
+      <w:ins w:id="52" w:author="PR Preview" w:date="2024-01-01T00:00:00Z">
         <w:r>
           <w:t xml:space="preserve"> </w:t>
         </w:r>
@@ -11768,7 +11730,7 @@
       <w:pPr>
         <w:pStyle w:val="BodyText"/>
       </w:pPr>
-      <w:ins w:id="65" w:author="PR Preview" w:date="2024-01-01T00:00:00Z">
+      <w:ins w:id="60" w:author="PR Preview" w:date="2024-01-01T00:00:00Z">
         <w:r>
           <w:t xml:space="preserve"> </w:t>
         </w:r>

</xml_diff>